<commit_message>
added forgotten email :)
</commit_message>
<xml_diff>
--- a/splekhov2026.docx
+++ b/splekhov2026.docx
@@ -1,6 +1,6 @@
 
 <file path=word/document.xml><?xml version="1.0" encoding="utf-8"?>
-<w:document xmlns:wpc="http://schemas.microsoft.com/office/word/2010/wordprocessingCanvas" xmlns:cx="http://schemas.microsoft.com/office/drawing/2014/chartex" xmlns:cx1="http://schemas.microsoft.com/office/drawing/2015/9/8/chartex" xmlns:cx2="http://schemas.microsoft.com/office/drawing/2015/10/21/chartex" xmlns:cx3="http://schemas.microsoft.com/office/drawing/2016/5/9/chartex" xmlns:cx4="http://schemas.microsoft.com/office/drawing/2016/5/10/chartex" xmlns:cx5="http://schemas.microsoft.com/office/drawing/2016/5/11/chartex" xmlns:cx6="http://schemas.microsoft.com/office/drawing/2016/5/12/chartex" xmlns:cx7="http://schemas.microsoft.com/office/drawing/2016/5/13/chartex" xmlns:cx8="http://schemas.microsoft.com/office/drawing/2016/5/14/chartex" xmlns:mc="http://schemas.openxmlformats.org/markup-compatibility/2006" xmlns:aink="http://schemas.microsoft.com/office/drawing/2016/ink" xmlns:am3d="http://schemas.microsoft.com/office/drawing/2017/model3d" xmlns:o="urn:schemas-microsoft-com:office:office" xmlns:oel="http://schemas.microsoft.com/office/2019/extlst" xmlns:r="http://schemas.openxmlformats.org/officeDocument/2006/relationships" xmlns:m="http://schemas.openxmlformats.org/officeDocument/2006/math" xmlns:v="urn:schemas-microsoft-com:vml" xmlns:wp14="http://schemas.microsoft.com/office/word/2010/wordprocessingDrawing" xmlns:wp="http://schemas.openxmlformats.org/drawingml/2006/wordprocessingDrawing" xmlns:w10="urn:schemas-microsoft-com:office:word" xmlns:w="http://schemas.openxmlformats.org/wordprocessingml/2006/main" xmlns:w14="http://schemas.microsoft.com/office/word/2010/wordml" xmlns:w15="http://schemas.microsoft.com/office/word/2012/wordml" xmlns:w16cex="http://schemas.microsoft.com/office/word/2018/wordml/cex" xmlns:w16cid="http://schemas.microsoft.com/office/word/2016/wordml/cid" xmlns:w16="http://schemas.microsoft.com/office/word/2018/wordml" xmlns:w16du="http://schemas.microsoft.com/office/word/2023/wordml/word16du" xmlns:w16sdtdh="http://schemas.microsoft.com/office/word/2020/wordml/sdtdatahash" xmlns:w16sdtfl="http://schemas.microsoft.com/office/word/2024/wordml/sdtformatlock" xmlns:w16se="http://schemas.microsoft.com/office/word/2015/wordml/symex" xmlns:wpg="http://schemas.microsoft.com/office/word/2010/wordprocessingGroup" xmlns:wpi="http://schemas.microsoft.com/office/word/2010/wordprocessingInk" xmlns:wne="http://schemas.microsoft.com/office/word/2006/wordml" xmlns:wps="http://schemas.microsoft.com/office/word/2010/wordprocessingShape" mc:Ignorable="w14 w15 w16se w16cid w16 w16cex w16sdtdh w16sdtfl w16du wp14">
+<w:document xmlns:wpc="http://schemas.microsoft.com/office/word/2010/wordprocessingCanvas" xmlns:cx="http://schemas.microsoft.com/office/drawing/2014/chartex" xmlns:cx1="http://schemas.microsoft.com/office/drawing/2015/9/8/chartex" xmlns:cx2="http://schemas.microsoft.com/office/drawing/2015/10/21/chartex" xmlns:cx3="http://schemas.microsoft.com/office/drawing/2016/5/9/chartex" xmlns:cx4="http://schemas.microsoft.com/office/drawing/2016/5/10/chartex" xmlns:cx5="http://schemas.microsoft.com/office/drawing/2016/5/11/chartex" xmlns:cx6="http://schemas.microsoft.com/office/drawing/2016/5/12/chartex" xmlns:cx7="http://schemas.microsoft.com/office/drawing/2016/5/13/chartex" xmlns:cx8="http://schemas.microsoft.com/office/drawing/2016/5/14/chartex" xmlns:mc="http://schemas.openxmlformats.org/markup-compatibility/2006" xmlns:m="http://schemas.openxmlformats.org/officeDocument/2006/math" xmlns:aink="http://schemas.microsoft.com/office/drawing/2016/ink" xmlns:am3d="http://schemas.microsoft.com/office/drawing/2017/model3d" xmlns:oel="http://schemas.microsoft.com/office/2019/extlst" xmlns:r="http://schemas.openxmlformats.org/officeDocument/2006/relationships" xmlns:wp14="http://schemas.microsoft.com/office/word/2010/wordprocessingDrawing" xmlns:wp="http://schemas.openxmlformats.org/drawingml/2006/wordprocessingDrawing" xmlns:wpg="http://schemas.microsoft.com/office/word/2010/wordprocessingGroup" xmlns:wpi="http://schemas.microsoft.com/office/word/2010/wordprocessingInk" xmlns:wps="http://schemas.microsoft.com/office/word/2010/wordprocessingShape" xmlns:o="urn:schemas-microsoft-com:office:office" xmlns:v="urn:schemas-microsoft-com:vml" xmlns:w10="urn:schemas-microsoft-com:office:word" xmlns:w="http://schemas.openxmlformats.org/wordprocessingml/2006/main" xmlns:w14="http://schemas.microsoft.com/office/word/2010/wordml" xmlns:w15="http://schemas.microsoft.com/office/word/2012/wordml" xmlns:w16cex="http://schemas.microsoft.com/office/word/2018/wordml/cex" xmlns:w16cid="http://schemas.microsoft.com/office/word/2016/wordml/cid" xmlns:w16="http://schemas.microsoft.com/office/word/2018/wordml" xmlns:w16sdtdh="http://schemas.microsoft.com/office/word/2020/wordml/sdtdatahash" xmlns:w16sdtfl="http://schemas.microsoft.com/office/word/2024/wordml/sdtformatlock" xmlns:w16se="http://schemas.microsoft.com/office/word/2015/wordml/symex" xmlns:w16du="http://schemas.microsoft.com/office/word/2023/wordml/word16du" xmlns:wne="http://schemas.microsoft.com/office/word/2006/wordml" mc:Ignorable="w14 w15 w16se w16cid w16 w16cex w16sdtdh w16sdtfl w16du wp14">
   <w:body>
     <w:p/>
     <w:tbl>
@@ -81,7 +81,10 @@
           </w:tcPr>
           <w:p>
             <w:r>
-              <w:t>Sergei Plekhov, +30-6970-243-069</w:t>
+              <w:t xml:space="preserve">Sergei Plekhov, </w:t>
+            </w:r>
+            <w:r>
+              <w:t>splekhov@gmail.com</w:t>
             </w:r>
           </w:p>
           <w:p>
@@ -151,13 +154,7 @@
               <w:rPr>
                 <w:lang w:val="en-US"/>
               </w:rPr>
-              <w:t>, K8s</w:t>
-            </w:r>
-            <w:r>
-              <w:rPr>
-                <w:lang w:val="en-US"/>
-              </w:rPr>
-              <w:t xml:space="preserve"> (</w:t>
+              <w:t>, K8s (</w:t>
             </w:r>
             <w:proofErr w:type="spellStart"/>
             <w:r>
@@ -171,13 +168,7 @@
               <w:rPr>
                 <w:lang w:val="en-US"/>
               </w:rPr>
-              <w:t>, rancher)</w:t>
-            </w:r>
-            <w:r>
-              <w:rPr>
-                <w:lang w:val="en-US"/>
-              </w:rPr>
-              <w:t>, Helm.</w:t>
+              <w:t>, rancher), Helm.</w:t>
             </w:r>
           </w:p>
           <w:p>
@@ -860,10 +851,7 @@
     </w:p>
     <w:p>
       <w:r>
-        <w:t xml:space="preserve">● Support </w:t>
-      </w:r>
-      <w:r>
-        <w:t>Oracle 9i deployments on local virtual machines (V</w:t>
+        <w:t>● Support Oracle 9i deployments on local virtual machines (V</w:t>
       </w:r>
       <w:r>
         <w:t>M</w:t>
@@ -890,7 +878,7 @@
 </file>
 
 <file path=word/styles.xml><?xml version="1.0" encoding="utf-8"?>
-<w:styles xmlns:mc="http://schemas.openxmlformats.org/markup-compatibility/2006" xmlns:r="http://schemas.openxmlformats.org/officeDocument/2006/relationships" xmlns:w="http://schemas.openxmlformats.org/wordprocessingml/2006/main" xmlns:w14="http://schemas.microsoft.com/office/word/2010/wordml" xmlns:w15="http://schemas.microsoft.com/office/word/2012/wordml" xmlns:w16cex="http://schemas.microsoft.com/office/word/2018/wordml/cex" xmlns:w16cid="http://schemas.microsoft.com/office/word/2016/wordml/cid" xmlns:w16="http://schemas.microsoft.com/office/word/2018/wordml" xmlns:w16du="http://schemas.microsoft.com/office/word/2023/wordml/word16du" xmlns:w16sdtdh="http://schemas.microsoft.com/office/word/2020/wordml/sdtdatahash" xmlns:w16sdtfl="http://schemas.microsoft.com/office/word/2024/wordml/sdtformatlock" xmlns:w16se="http://schemas.microsoft.com/office/word/2015/wordml/symex" mc:Ignorable="w14 w15 w16se w16cid w16 w16cex w16sdtdh w16sdtfl w16du">
+<w:styles xmlns:mc="http://schemas.openxmlformats.org/markup-compatibility/2006" xmlns:r="http://schemas.openxmlformats.org/officeDocument/2006/relationships" xmlns:w="http://schemas.openxmlformats.org/wordprocessingml/2006/main" xmlns:w14="http://schemas.microsoft.com/office/word/2010/wordml" xmlns:w15="http://schemas.microsoft.com/office/word/2012/wordml" xmlns:w16cex="http://schemas.microsoft.com/office/word/2018/wordml/cex" xmlns:w16cid="http://schemas.microsoft.com/office/word/2016/wordml/cid" xmlns:w16="http://schemas.microsoft.com/office/word/2018/wordml" xmlns:w16sdtdh="http://schemas.microsoft.com/office/word/2020/wordml/sdtdatahash" xmlns:w16sdtfl="http://schemas.microsoft.com/office/word/2024/wordml/sdtformatlock" xmlns:w16se="http://schemas.microsoft.com/office/word/2015/wordml/symex" xmlns:w16du="http://schemas.microsoft.com/office/word/2023/wordml/word16du" mc:Ignorable="w14 w15 w16se w16cid w16 w16cex w16sdtdh w16sdtfl w16du">
   <w:docDefaults>
     <w:rPrDefault>
       <w:rPr>

</xml_diff>